<commit_message>
fixed a repo bug
</commit_message>
<xml_diff>
--- a/pioject.docx
+++ b/pioject.docx
@@ -5,7 +5,7 @@
     <w:p>
       <w:r>
         <w:drawing>
-          <wp:anchor distT="0" distB="0" distL="114300" distR="114300" simplePos="0" relativeHeight="251658240" behindDoc="1" locked="0" layoutInCell="1" allowOverlap="1" wp14:anchorId="6A16D094" wp14:editId="1976F030">
+          <wp:anchor distT="0" distB="0" distL="114300" distR="114300" simplePos="0" relativeHeight="251658240" behindDoc="1" locked="0" layoutInCell="1" allowOverlap="1" wp14:anchorId="6A16D094" wp14:editId="715A5E98">
             <wp:simplePos x="0" y="0"/>
             <wp:positionH relativeFrom="margin">
               <wp:align>right</wp:align>
@@ -84,10 +84,7 @@
         <w:t>ЦВЕТОВА ПАЛИТРА, КОЯТО ИЗБИРАМ ДА ИЗПОЛЗВАМ</w:t>
       </w:r>
       <w:r>
-        <w:t xml:space="preserve"> ЗА МОЯ САЙ</w:t>
-      </w:r>
-      <w:r>
-        <w:t>Т</w:t>
+        <w:t xml:space="preserve"> ЗА МОЯ САЙТ</w:t>
       </w:r>
     </w:p>
     <w:p/>
@@ -142,9 +139,1052 @@
       <w:r>
         <w:t xml:space="preserve"> </w:t>
       </w:r>
+      <w:r>
+        <w:t>rgb(72, 172, 240)</w:t>
+      </w:r>
     </w:p>
     <w:p/>
     <w:p/>
+    <w:p>
+      <w:r>
+        <w:br w:type="page"/>
+      </w:r>
+    </w:p>
+    <w:p>
+      <w:r>
+        <w:lastRenderedPageBreak/>
+        <mc:AlternateContent>
+          <mc:Choice Requires="wps">
+            <w:drawing>
+              <wp:anchor distT="0" distB="0" distL="114300" distR="114300" simplePos="0" relativeHeight="251666432" behindDoc="0" locked="0" layoutInCell="1" allowOverlap="1" wp14:anchorId="0DDB2581" wp14:editId="47E81AD7">
+                <wp:simplePos x="0" y="0"/>
+                <wp:positionH relativeFrom="column">
+                  <wp:posOffset>1188085</wp:posOffset>
+                </wp:positionH>
+                <wp:positionV relativeFrom="paragraph">
+                  <wp:posOffset>8145145</wp:posOffset>
+                </wp:positionV>
+                <wp:extent cx="769620" cy="670560"/>
+                <wp:effectExtent l="0" t="0" r="11430" b="15240"/>
+                <wp:wrapNone/>
+                <wp:docPr id="270937385" name="Text Box 9"/>
+                <wp:cNvGraphicFramePr/>
+                <a:graphic xmlns:a="http://schemas.openxmlformats.org/drawingml/2006/main">
+                  <a:graphicData uri="http://schemas.microsoft.com/office/word/2010/wordprocessingShape">
+                    <wps:wsp>
+                      <wps:cNvSpPr txBox="1"/>
+                      <wps:spPr>
+                        <a:xfrm>
+                          <a:off x="0" y="0"/>
+                          <a:ext cx="769620" cy="670560"/>
+                        </a:xfrm>
+                        <a:prstGeom prst="rect">
+                          <a:avLst/>
+                        </a:prstGeom>
+                        <a:solidFill>
+                          <a:schemeClr val="lt1"/>
+                        </a:solidFill>
+                        <a:ln w="6350">
+                          <a:solidFill>
+                            <a:prstClr val="black"/>
+                          </a:solidFill>
+                        </a:ln>
+                      </wps:spPr>
+                      <wps:txbx>
+                        <w:txbxContent>
+                          <w:p>
+                            <w:pPr>
+                              <w:rPr>
+                                <w:lang w:val="en-US"/>
+                              </w:rPr>
+                            </w:pPr>
+                            <w:r>
+                              <w:rPr>
+                                <w:lang w:val="en-US"/>
+                              </w:rPr>
+                              <w:t>Icon 1</w:t>
+                            </w:r>
+                          </w:p>
+                        </w:txbxContent>
+                      </wps:txbx>
+                      <wps:bodyPr rot="0" spcFirstLastPara="0" vertOverflow="overflow" horzOverflow="overflow" vert="horz" wrap="square" lIns="91440" tIns="45720" rIns="91440" bIns="45720" numCol="1" spcCol="0" rtlCol="0" fromWordArt="0" anchor="t" anchorCtr="0" forceAA="0" compatLnSpc="1">
+                        <a:prstTxWarp prst="textNoShape">
+                          <a:avLst/>
+                        </a:prstTxWarp>
+                        <a:noAutofit/>
+                      </wps:bodyPr>
+                    </wps:wsp>
+                  </a:graphicData>
+                </a:graphic>
+                <wp14:sizeRelV relativeFrom="margin">
+                  <wp14:pctHeight>0</wp14:pctHeight>
+                </wp14:sizeRelV>
+              </wp:anchor>
+            </w:drawing>
+          </mc:Choice>
+          <mc:Fallback>
+            <w:pict>
+              <v:shapetype w14:anchorId="0DDB2581" id="_x0000_t202" coordsize="21600,21600" o:spt="202" path="m,l,21600r21600,l21600,xe">
+                <v:stroke joinstyle="miter"/>
+                <v:path gradientshapeok="t" o:connecttype="rect"/>
+              </v:shapetype>
+              <v:shape id="Text Box 9" o:spid="_x0000_s1026" type="#_x0000_t202" style="position:absolute;margin-left:93.55pt;margin-top:641.35pt;width:60.6pt;height:52.8pt;z-index:251666432;visibility:visible;mso-wrap-style:square;mso-height-percent:0;mso-wrap-distance-left:9pt;mso-wrap-distance-top:0;mso-wrap-distance-right:9pt;mso-wrap-distance-bottom:0;mso-position-horizontal:absolute;mso-position-horizontal-relative:text;mso-position-vertical:absolute;mso-position-vertical-relative:text;mso-height-percent:0;mso-height-relative:margin;v-text-anchor:top" o:gfxdata="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" fillcolor="white [3201]" strokeweight=".5pt">
+                <v:textbox>
+                  <w:txbxContent>
+                    <w:p>
+                      <w:pPr>
+                        <w:rPr>
+                          <w:lang w:val="en-US"/>
+                        </w:rPr>
+                      </w:pPr>
+                      <w:r>
+                        <w:rPr>
+                          <w:lang w:val="en-US"/>
+                        </w:rPr>
+                        <w:t>Icon 1</w:t>
+                      </w:r>
+                    </w:p>
+                  </w:txbxContent>
+                </v:textbox>
+              </v:shape>
+            </w:pict>
+          </mc:Fallback>
+        </mc:AlternateContent>
+      </w:r>
+      <w:r>
+        <mc:AlternateContent>
+          <mc:Choice Requires="wps">
+            <w:drawing>
+              <wp:anchor distT="0" distB="0" distL="114300" distR="114300" simplePos="0" relativeHeight="251667456" behindDoc="0" locked="0" layoutInCell="1" allowOverlap="1" wp14:anchorId="5E5CA467" wp14:editId="2BD27F45">
+                <wp:simplePos x="0" y="0"/>
+                <wp:positionH relativeFrom="column">
+                  <wp:posOffset>2849245</wp:posOffset>
+                </wp:positionH>
+                <wp:positionV relativeFrom="paragraph">
+                  <wp:posOffset>8183245</wp:posOffset>
+                </wp:positionV>
+                <wp:extent cx="685800" cy="632460"/>
+                <wp:effectExtent l="0" t="0" r="19050" b="15240"/>
+                <wp:wrapNone/>
+                <wp:docPr id="68046332" name="Text Box 10"/>
+                <wp:cNvGraphicFramePr/>
+                <a:graphic xmlns:a="http://schemas.openxmlformats.org/drawingml/2006/main">
+                  <a:graphicData uri="http://schemas.microsoft.com/office/word/2010/wordprocessingShape">
+                    <wps:wsp>
+                      <wps:cNvSpPr txBox="1"/>
+                      <wps:spPr>
+                        <a:xfrm>
+                          <a:off x="0" y="0"/>
+                          <a:ext cx="685800" cy="632460"/>
+                        </a:xfrm>
+                        <a:prstGeom prst="rect">
+                          <a:avLst/>
+                        </a:prstGeom>
+                        <a:solidFill>
+                          <a:schemeClr val="lt1"/>
+                        </a:solidFill>
+                        <a:ln w="6350">
+                          <a:solidFill>
+                            <a:prstClr val="black"/>
+                          </a:solidFill>
+                        </a:ln>
+                      </wps:spPr>
+                      <wps:txbx>
+                        <w:txbxContent>
+                          <w:p>
+                            <w:pPr>
+                              <w:rPr>
+                                <w:lang w:val="en-US"/>
+                              </w:rPr>
+                            </w:pPr>
+                            <w:r>
+                              <w:rPr>
+                                <w:lang w:val="en-US"/>
+                              </w:rPr>
+                              <w:t>Icon 2</w:t>
+                            </w:r>
+                          </w:p>
+                        </w:txbxContent>
+                      </wps:txbx>
+                      <wps:bodyPr rot="0" spcFirstLastPara="0" vertOverflow="overflow" horzOverflow="overflow" vert="horz" wrap="square" lIns="91440" tIns="45720" rIns="91440" bIns="45720" numCol="1" spcCol="0" rtlCol="0" fromWordArt="0" anchor="t" anchorCtr="0" forceAA="0" compatLnSpc="1">
+                        <a:prstTxWarp prst="textNoShape">
+                          <a:avLst/>
+                        </a:prstTxWarp>
+                        <a:noAutofit/>
+                      </wps:bodyPr>
+                    </wps:wsp>
+                  </a:graphicData>
+                </a:graphic>
+              </wp:anchor>
+            </w:drawing>
+          </mc:Choice>
+          <mc:Fallback>
+            <w:pict>
+              <v:shape w14:anchorId="5E5CA467" id="Text Box 10" o:spid="_x0000_s1027" type="#_x0000_t202" style="position:absolute;margin-left:224.35pt;margin-top:644.35pt;width:54pt;height:49.8pt;z-index:251667456;visibility:visible;mso-wrap-style:square;mso-wrap-distance-left:9pt;mso-wrap-distance-top:0;mso-wrap-distance-right:9pt;mso-wrap-distance-bottom:0;mso-position-horizontal:absolute;mso-position-horizontal-relative:text;mso-position-vertical:absolute;mso-position-vertical-relative:text;v-text-anchor:top" o:gfxdata="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" fillcolor="white [3201]" strokeweight=".5pt">
+                <v:textbox>
+                  <w:txbxContent>
+                    <w:p>
+                      <w:pPr>
+                        <w:rPr>
+                          <w:lang w:val="en-US"/>
+                        </w:rPr>
+                      </w:pPr>
+                      <w:r>
+                        <w:rPr>
+                          <w:lang w:val="en-US"/>
+                        </w:rPr>
+                        <w:t>Icon 2</w:t>
+                      </w:r>
+                    </w:p>
+                  </w:txbxContent>
+                </v:textbox>
+              </v:shape>
+            </w:pict>
+          </mc:Fallback>
+        </mc:AlternateContent>
+      </w:r>
+      <w:r>
+        <mc:AlternateContent>
+          <mc:Choice Requires="wps">
+            <w:drawing>
+              <wp:anchor distT="0" distB="0" distL="114300" distR="114300" simplePos="0" relativeHeight="251668480" behindDoc="0" locked="0" layoutInCell="1" allowOverlap="1" wp14:anchorId="284D52EC" wp14:editId="4BB38E88">
+                <wp:simplePos x="0" y="0"/>
+                <wp:positionH relativeFrom="column">
+                  <wp:posOffset>4678045</wp:posOffset>
+                </wp:positionH>
+                <wp:positionV relativeFrom="paragraph">
+                  <wp:posOffset>8183245</wp:posOffset>
+                </wp:positionV>
+                <wp:extent cx="739140" cy="609600"/>
+                <wp:effectExtent l="0" t="0" r="22860" b="19050"/>
+                <wp:wrapNone/>
+                <wp:docPr id="502982091" name="Text Box 11"/>
+                <wp:cNvGraphicFramePr/>
+                <a:graphic xmlns:a="http://schemas.openxmlformats.org/drawingml/2006/main">
+                  <a:graphicData uri="http://schemas.microsoft.com/office/word/2010/wordprocessingShape">
+                    <wps:wsp>
+                      <wps:cNvSpPr txBox="1"/>
+                      <wps:spPr>
+                        <a:xfrm>
+                          <a:off x="0" y="0"/>
+                          <a:ext cx="739140" cy="609600"/>
+                        </a:xfrm>
+                        <a:prstGeom prst="rect">
+                          <a:avLst/>
+                        </a:prstGeom>
+                        <a:solidFill>
+                          <a:schemeClr val="lt1"/>
+                        </a:solidFill>
+                        <a:ln w="6350">
+                          <a:solidFill>
+                            <a:prstClr val="black"/>
+                          </a:solidFill>
+                        </a:ln>
+                      </wps:spPr>
+                      <wps:txbx>
+                        <w:txbxContent>
+                          <w:p>
+                            <w:pPr>
+                              <w:rPr>
+                                <w:lang w:val="en-US"/>
+                              </w:rPr>
+                            </w:pPr>
+                            <w:r>
+                              <w:rPr>
+                                <w:lang w:val="en-US"/>
+                              </w:rPr>
+                              <w:t>Icon 3</w:t>
+                            </w:r>
+                          </w:p>
+                        </w:txbxContent>
+                      </wps:txbx>
+                      <wps:bodyPr rot="0" spcFirstLastPara="0" vertOverflow="overflow" horzOverflow="overflow" vert="horz" wrap="square" lIns="91440" tIns="45720" rIns="91440" bIns="45720" numCol="1" spcCol="0" rtlCol="0" fromWordArt="0" anchor="t" anchorCtr="0" forceAA="0" compatLnSpc="1">
+                        <a:prstTxWarp prst="textNoShape">
+                          <a:avLst/>
+                        </a:prstTxWarp>
+                        <a:noAutofit/>
+                      </wps:bodyPr>
+                    </wps:wsp>
+                  </a:graphicData>
+                </a:graphic>
+                <wp14:sizeRelV relativeFrom="margin">
+                  <wp14:pctHeight>0</wp14:pctHeight>
+                </wp14:sizeRelV>
+              </wp:anchor>
+            </w:drawing>
+          </mc:Choice>
+          <mc:Fallback>
+            <w:pict>
+              <v:shape w14:anchorId="284D52EC" id="Text Box 11" o:spid="_x0000_s1028" type="#_x0000_t202" style="position:absolute;margin-left:368.35pt;margin-top:644.35pt;width:58.2pt;height:48pt;z-index:251668480;visibility:visible;mso-wrap-style:square;mso-height-percent:0;mso-wrap-distance-left:9pt;mso-wrap-distance-top:0;mso-wrap-distance-right:9pt;mso-wrap-distance-bottom:0;mso-position-horizontal:absolute;mso-position-horizontal-relative:text;mso-position-vertical:absolute;mso-position-vertical-relative:text;mso-height-percent:0;mso-height-relative:margin;v-text-anchor:top" o:gfxdata="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" fillcolor="white [3201]" strokeweight=".5pt">
+                <v:textbox>
+                  <w:txbxContent>
+                    <w:p>
+                      <w:pPr>
+                        <w:rPr>
+                          <w:lang w:val="en-US"/>
+                        </w:rPr>
+                      </w:pPr>
+                      <w:r>
+                        <w:rPr>
+                          <w:lang w:val="en-US"/>
+                        </w:rPr>
+                        <w:t>Icon 3</w:t>
+                      </w:r>
+                    </w:p>
+                  </w:txbxContent>
+                </v:textbox>
+              </v:shape>
+            </w:pict>
+          </mc:Fallback>
+        </mc:AlternateContent>
+      </w:r>
+      <w:r>
+        <mc:AlternateContent>
+          <mc:Choice Requires="wps">
+            <w:drawing>
+              <wp:anchor distT="0" distB="0" distL="114300" distR="114300" simplePos="0" relativeHeight="251665408" behindDoc="0" locked="0" layoutInCell="1" allowOverlap="1" wp14:anchorId="67354678" wp14:editId="0B0E8040">
+                <wp:simplePos x="0" y="0"/>
+                <wp:positionH relativeFrom="column">
+                  <wp:posOffset>-153035</wp:posOffset>
+                </wp:positionH>
+                <wp:positionV relativeFrom="paragraph">
+                  <wp:posOffset>8038465</wp:posOffset>
+                </wp:positionV>
+                <wp:extent cx="6210300" cy="876300"/>
+                <wp:effectExtent l="0" t="0" r="19050" b="19050"/>
+                <wp:wrapNone/>
+                <wp:docPr id="1970759779" name="Text Box 8"/>
+                <wp:cNvGraphicFramePr/>
+                <a:graphic xmlns:a="http://schemas.openxmlformats.org/drawingml/2006/main">
+                  <a:graphicData uri="http://schemas.microsoft.com/office/word/2010/wordprocessingShape">
+                    <wps:wsp>
+                      <wps:cNvSpPr txBox="1"/>
+                      <wps:spPr>
+                        <a:xfrm>
+                          <a:off x="0" y="0"/>
+                          <a:ext cx="6210300" cy="876300"/>
+                        </a:xfrm>
+                        <a:prstGeom prst="rect">
+                          <a:avLst/>
+                        </a:prstGeom>
+                        <a:solidFill>
+                          <a:srgbClr val="7EA172"/>
+                        </a:solidFill>
+                        <a:ln w="6350">
+                          <a:solidFill>
+                            <a:prstClr val="black"/>
+                          </a:solidFill>
+                        </a:ln>
+                      </wps:spPr>
+                      <wps:txbx>
+                        <w:txbxContent>
+                          <w:p>
+                            <w:pPr>
+                              <w:rPr>
+                                <w:lang w:val="en-US"/>
+                              </w:rPr>
+                            </w:pPr>
+                            <w:r>
+                              <w:rPr>
+                                <w:lang w:val="en-US"/>
+                              </w:rPr>
+                              <w:t>Id footer</w:t>
+                            </w:r>
+                          </w:p>
+                        </w:txbxContent>
+                      </wps:txbx>
+                      <wps:bodyPr rot="0" spcFirstLastPara="0" vertOverflow="overflow" horzOverflow="overflow" vert="horz" wrap="square" lIns="91440" tIns="45720" rIns="91440" bIns="45720" numCol="1" spcCol="0" rtlCol="0" fromWordArt="0" anchor="t" anchorCtr="0" forceAA="0" compatLnSpc="1">
+                        <a:prstTxWarp prst="textNoShape">
+                          <a:avLst/>
+                        </a:prstTxWarp>
+                        <a:noAutofit/>
+                      </wps:bodyPr>
+                    </wps:wsp>
+                  </a:graphicData>
+                </a:graphic>
+              </wp:anchor>
+            </w:drawing>
+          </mc:Choice>
+          <mc:Fallback>
+            <w:pict>
+              <v:shape w14:anchorId="67354678" id="Text Box 8" o:spid="_x0000_s1029" type="#_x0000_t202" style="position:absolute;margin-left:-12.05pt;margin-top:632.95pt;width:489pt;height:69pt;z-index:251665408;visibility:visible;mso-wrap-style:square;mso-wrap-distance-left:9pt;mso-wrap-distance-top:0;mso-wrap-distance-right:9pt;mso-wrap-distance-bottom:0;mso-position-horizontal:absolute;mso-position-horizontal-relative:text;mso-position-vertical:absolute;mso-position-vertical-relative:text;v-text-anchor:top" o:gfxdata="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" fillcolor="#7ea172" strokeweight=".5pt">
+                <v:textbox>
+                  <w:txbxContent>
+                    <w:p>
+                      <w:pPr>
+                        <w:rPr>
+                          <w:lang w:val="en-US"/>
+                        </w:rPr>
+                      </w:pPr>
+                      <w:r>
+                        <w:rPr>
+                          <w:lang w:val="en-US"/>
+                        </w:rPr>
+                        <w:t>Id footer</w:t>
+                      </w:r>
+                    </w:p>
+                  </w:txbxContent>
+                </v:textbox>
+              </v:shape>
+            </w:pict>
+          </mc:Fallback>
+        </mc:AlternateContent>
+      </w:r>
+      <w:r>
+        <mc:AlternateContent>
+          <mc:Choice Requires="wps">
+            <w:drawing>
+              <wp:anchor distT="0" distB="0" distL="114300" distR="114300" simplePos="0" relativeHeight="251664384" behindDoc="0" locked="0" layoutInCell="1" allowOverlap="1" wp14:anchorId="50CEB486" wp14:editId="222780D2">
+                <wp:simplePos x="0" y="0"/>
+                <wp:positionH relativeFrom="column">
+                  <wp:posOffset>-259715</wp:posOffset>
+                </wp:positionH>
+                <wp:positionV relativeFrom="paragraph">
+                  <wp:posOffset>2072005</wp:posOffset>
+                </wp:positionV>
+                <wp:extent cx="6347460" cy="5669280"/>
+                <wp:effectExtent l="0" t="0" r="15240" b="26670"/>
+                <wp:wrapNone/>
+                <wp:docPr id="1443952094" name="Text Box 7"/>
+                <wp:cNvGraphicFramePr/>
+                <a:graphic xmlns:a="http://schemas.openxmlformats.org/drawingml/2006/main">
+                  <a:graphicData uri="http://schemas.microsoft.com/office/word/2010/wordprocessingShape">
+                    <wps:wsp>
+                      <wps:cNvSpPr txBox="1"/>
+                      <wps:spPr>
+                        <a:xfrm>
+                          <a:off x="0" y="0"/>
+                          <a:ext cx="6347460" cy="5669280"/>
+                        </a:xfrm>
+                        <a:prstGeom prst="rect">
+                          <a:avLst/>
+                        </a:prstGeom>
+                        <a:solidFill>
+                          <a:srgbClr val="48ACF0"/>
+                        </a:solidFill>
+                        <a:ln w="6350">
+                          <a:solidFill>
+                            <a:prstClr val="black"/>
+                          </a:solidFill>
+                        </a:ln>
+                      </wps:spPr>
+                      <wps:txbx>
+                        <w:txbxContent>
+                          <w:p>
+                            <w:pPr>
+                              <w:rPr>
+                                <w:lang w:val="en-US"/>
+                              </w:rPr>
+                            </w:pPr>
+                            <w:r>
+                              <w:rPr>
+                                <w:lang w:val="en-US"/>
+                              </w:rPr>
+                              <w:t>Id main</w:t>
+                            </w:r>
+                          </w:p>
+                        </w:txbxContent>
+                      </wps:txbx>
+                      <wps:bodyPr rot="0" spcFirstLastPara="0" vertOverflow="overflow" horzOverflow="overflow" vert="horz" wrap="square" lIns="91440" tIns="45720" rIns="91440" bIns="45720" numCol="1" spcCol="0" rtlCol="0" fromWordArt="0" anchor="t" anchorCtr="0" forceAA="0" compatLnSpc="1">
+                        <a:prstTxWarp prst="textNoShape">
+                          <a:avLst/>
+                        </a:prstTxWarp>
+                        <a:noAutofit/>
+                      </wps:bodyPr>
+                    </wps:wsp>
+                  </a:graphicData>
+                </a:graphic>
+                <wp14:sizeRelV relativeFrom="margin">
+                  <wp14:pctHeight>0</wp14:pctHeight>
+                </wp14:sizeRelV>
+              </wp:anchor>
+            </w:drawing>
+          </mc:Choice>
+          <mc:Fallback>
+            <w:pict>
+              <v:shape w14:anchorId="50CEB486" id="Text Box 7" o:spid="_x0000_s1030" type="#_x0000_t202" style="position:absolute;margin-left:-20.45pt;margin-top:163.15pt;width:499.8pt;height:446.4pt;z-index:251664384;visibility:visible;mso-wrap-style:square;mso-height-percent:0;mso-wrap-distance-left:9pt;mso-wrap-distance-top:0;mso-wrap-distance-right:9pt;mso-wrap-distance-bottom:0;mso-position-horizontal:absolute;mso-position-horizontal-relative:text;mso-position-vertical:absolute;mso-position-vertical-relative:text;mso-height-percent:0;mso-height-relative:margin;v-text-anchor:top" o:gfxdata="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" fillcolor="#48acf0" strokeweight=".5pt">
+                <v:textbox>
+                  <w:txbxContent>
+                    <w:p>
+                      <w:pPr>
+                        <w:rPr>
+                          <w:lang w:val="en-US"/>
+                        </w:rPr>
+                      </w:pPr>
+                      <w:r>
+                        <w:rPr>
+                          <w:lang w:val="en-US"/>
+                        </w:rPr>
+                        <w:t>Id main</w:t>
+                      </w:r>
+                    </w:p>
+                  </w:txbxContent>
+                </v:textbox>
+              </v:shape>
+            </w:pict>
+          </mc:Fallback>
+        </mc:AlternateContent>
+      </w:r>
+      <w:r>
+        <mc:AlternateContent>
+          <mc:Choice Requires="wps">
+            <w:drawing>
+              <wp:anchor distT="0" distB="0" distL="114300" distR="114300" simplePos="0" relativeHeight="251663360" behindDoc="0" locked="0" layoutInCell="1" allowOverlap="1" wp14:anchorId="46FB3F46" wp14:editId="39D835DC">
+                <wp:simplePos x="0" y="0"/>
+                <wp:positionH relativeFrom="column">
+                  <wp:posOffset>-290195</wp:posOffset>
+                </wp:positionH>
+                <wp:positionV relativeFrom="paragraph">
+                  <wp:posOffset>1210945</wp:posOffset>
+                </wp:positionV>
+                <wp:extent cx="6377940" cy="708660"/>
+                <wp:effectExtent l="0" t="0" r="22860" b="15240"/>
+                <wp:wrapNone/>
+                <wp:docPr id="1127416855" name="Text Box 6"/>
+                <wp:cNvGraphicFramePr/>
+                <a:graphic xmlns:a="http://schemas.openxmlformats.org/drawingml/2006/main">
+                  <a:graphicData uri="http://schemas.microsoft.com/office/word/2010/wordprocessingShape">
+                    <wps:wsp>
+                      <wps:cNvSpPr txBox="1"/>
+                      <wps:spPr>
+                        <a:xfrm>
+                          <a:off x="0" y="0"/>
+                          <a:ext cx="6377940" cy="708660"/>
+                        </a:xfrm>
+                        <a:prstGeom prst="rect">
+                          <a:avLst/>
+                        </a:prstGeom>
+                        <a:solidFill>
+                          <a:srgbClr val="353D2F"/>
+                        </a:solidFill>
+                        <a:ln w="6350">
+                          <a:solidFill>
+                            <a:prstClr val="black"/>
+                          </a:solidFill>
+                        </a:ln>
+                      </wps:spPr>
+                      <wps:txbx>
+                        <w:txbxContent>
+                          <w:p>
+                            <w:r>
+                              <w:t xml:space="preserve">  </w:t>
+                            </w:r>
+                            <w:r>
+                              <w:t>НАЧАЛО   ЗА ФИРМАТА   КАТАЛОГ   КОНТАКТ   ГАЛЕРИЯ   ПРОМОЦИЯ   АВТОР</w:t>
+                            </w:r>
+                          </w:p>
+                        </w:txbxContent>
+                      </wps:txbx>
+                      <wps:bodyPr rot="0" spcFirstLastPara="0" vertOverflow="overflow" horzOverflow="overflow" vert="horz" wrap="square" lIns="91440" tIns="45720" rIns="91440" bIns="45720" numCol="1" spcCol="0" rtlCol="0" fromWordArt="0" anchor="t" anchorCtr="0" forceAA="0" compatLnSpc="1">
+                        <a:prstTxWarp prst="textNoShape">
+                          <a:avLst/>
+                        </a:prstTxWarp>
+                        <a:noAutofit/>
+                      </wps:bodyPr>
+                    </wps:wsp>
+                  </a:graphicData>
+                </a:graphic>
+                <wp14:sizeRelH relativeFrom="margin">
+                  <wp14:pctWidth>0</wp14:pctWidth>
+                </wp14:sizeRelH>
+              </wp:anchor>
+            </w:drawing>
+          </mc:Choice>
+          <mc:Fallback>
+            <w:pict>
+              <v:shape w14:anchorId="46FB3F46" id="Text Box 6" o:spid="_x0000_s1031" type="#_x0000_t202" style="position:absolute;margin-left:-22.85pt;margin-top:95.35pt;width:502.2pt;height:55.8pt;z-index:251663360;visibility:visible;mso-wrap-style:square;mso-width-percent:0;mso-wrap-distance-left:9pt;mso-wrap-distance-top:0;mso-wrap-distance-right:9pt;mso-wrap-distance-bottom:0;mso-position-horizontal:absolute;mso-position-horizontal-relative:text;mso-position-vertical:absolute;mso-position-vertical-relative:text;mso-width-percent:0;mso-width-relative:margin;v-text-anchor:top" o:gfxdata="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" fillcolor="#353d2f" strokeweight=".5pt">
+                <v:textbox>
+                  <w:txbxContent>
+                    <w:p>
+                      <w:r>
+                        <w:t xml:space="preserve">  </w:t>
+                      </w:r>
+                      <w:r>
+                        <w:t>НАЧАЛО   ЗА ФИРМАТА   КАТАЛОГ   КОНТАКТ   ГАЛЕРИЯ   ПРОМОЦИЯ   АВТОР</w:t>
+                      </w:r>
+                    </w:p>
+                  </w:txbxContent>
+                </v:textbox>
+              </v:shape>
+            </w:pict>
+          </mc:Fallback>
+        </mc:AlternateContent>
+      </w:r>
+      <w:r>
+        <mc:AlternateContent>
+          <mc:Choice Requires="wps">
+            <w:drawing>
+              <wp:anchor distT="0" distB="0" distL="114300" distR="114300" simplePos="0" relativeHeight="251660288" behindDoc="0" locked="0" layoutInCell="1" allowOverlap="1" wp14:anchorId="50E7DDFE" wp14:editId="368982A2">
+                <wp:simplePos x="0" y="0"/>
+                <wp:positionH relativeFrom="margin">
+                  <wp:posOffset>-351155</wp:posOffset>
+                </wp:positionH>
+                <wp:positionV relativeFrom="paragraph">
+                  <wp:posOffset>-84455</wp:posOffset>
+                </wp:positionV>
+                <wp:extent cx="6492240" cy="1135380"/>
+                <wp:effectExtent l="0" t="0" r="22860" b="26670"/>
+                <wp:wrapNone/>
+                <wp:docPr id="401064228" name="Text Box 2"/>
+                <wp:cNvGraphicFramePr/>
+                <a:graphic xmlns:a="http://schemas.openxmlformats.org/drawingml/2006/main">
+                  <a:graphicData uri="http://schemas.microsoft.com/office/word/2010/wordprocessingShape">
+                    <wps:wsp>
+                      <wps:cNvSpPr txBox="1"/>
+                      <wps:spPr>
+                        <a:xfrm>
+                          <a:off x="0" y="0"/>
+                          <a:ext cx="6492240" cy="1135380"/>
+                        </a:xfrm>
+                        <a:prstGeom prst="rect">
+                          <a:avLst/>
+                        </a:prstGeom>
+                        <a:solidFill>
+                          <a:srgbClr val="51BBFE"/>
+                        </a:solidFill>
+                        <a:ln w="6350">
+                          <a:solidFill>
+                            <a:prstClr val="black"/>
+                          </a:solidFill>
+                        </a:ln>
+                      </wps:spPr>
+                      <wps:txbx>
+                        <w:txbxContent>
+                          <w:p>
+                            <w:pPr>
+                              <w:rPr>
+                                <w:lang w:val="en-US"/>
+                              </w:rPr>
+                            </w:pPr>
+                            <w:r>
+                              <w:rPr>
+                                <w:lang w:val="en-US"/>
+                              </w:rPr>
+                              <w:t>Id header</w:t>
+                            </w:r>
+                          </w:p>
+                        </w:txbxContent>
+                      </wps:txbx>
+                      <wps:bodyPr rot="0" spcFirstLastPara="0" vertOverflow="overflow" horzOverflow="overflow" vert="horz" wrap="square" lIns="91440" tIns="45720" rIns="91440" bIns="45720" numCol="1" spcCol="0" rtlCol="0" fromWordArt="0" anchor="t" anchorCtr="0" forceAA="0" compatLnSpc="1">
+                        <a:prstTxWarp prst="textNoShape">
+                          <a:avLst/>
+                        </a:prstTxWarp>
+                        <a:noAutofit/>
+                      </wps:bodyPr>
+                    </wps:wsp>
+                  </a:graphicData>
+                </a:graphic>
+                <wp14:sizeRelH relativeFrom="margin">
+                  <wp14:pctWidth>0</wp14:pctWidth>
+                </wp14:sizeRelH>
+              </wp:anchor>
+            </w:drawing>
+          </mc:Choice>
+          <mc:Fallback>
+            <w:pict>
+              <v:shape w14:anchorId="50E7DDFE" id="Text Box 2" o:spid="_x0000_s1032" type="#_x0000_t202" style="position:absolute;margin-left:-27.65pt;margin-top:-6.65pt;width:511.2pt;height:89.4pt;z-index:251660288;visibility:visible;mso-wrap-style:square;mso-width-percent:0;mso-wrap-distance-left:9pt;mso-wrap-distance-top:0;mso-wrap-distance-right:9pt;mso-wrap-distance-bottom:0;mso-position-horizontal:absolute;mso-position-horizontal-relative:margin;mso-position-vertical:absolute;mso-position-vertical-relative:text;mso-width-percent:0;mso-width-relative:margin;v-text-anchor:top" o:gfxdata="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" fillcolor="#51bbfe" strokeweight=".5pt">
+                <v:textbox>
+                  <w:txbxContent>
+                    <w:p>
+                      <w:pPr>
+                        <w:rPr>
+                          <w:lang w:val="en-US"/>
+                        </w:rPr>
+                      </w:pPr>
+                      <w:r>
+                        <w:rPr>
+                          <w:lang w:val="en-US"/>
+                        </w:rPr>
+                        <w:t>Id header</w:t>
+                      </w:r>
+                    </w:p>
+                  </w:txbxContent>
+                </v:textbox>
+                <w10:wrap anchorx="margin"/>
+              </v:shape>
+            </w:pict>
+          </mc:Fallback>
+        </mc:AlternateContent>
+      </w:r>
+      <w:r>
+        <mc:AlternateContent>
+          <mc:Choice Requires="wps">
+            <w:drawing>
+              <wp:anchor distT="0" distB="0" distL="114300" distR="114300" simplePos="0" relativeHeight="251659775" behindDoc="0" locked="0" layoutInCell="1" allowOverlap="1" wp14:anchorId="2377275A" wp14:editId="7D88C97B">
+                <wp:simplePos x="0" y="0"/>
+                <wp:positionH relativeFrom="margin">
+                  <wp:posOffset>-424815</wp:posOffset>
+                </wp:positionH>
+                <wp:positionV relativeFrom="paragraph">
+                  <wp:posOffset>-252095</wp:posOffset>
+                </wp:positionV>
+                <wp:extent cx="6675120" cy="9502140"/>
+                <wp:effectExtent l="0" t="0" r="11430" b="22860"/>
+                <wp:wrapNone/>
+                <wp:docPr id="2027695077" name="Text Box 5"/>
+                <wp:cNvGraphicFramePr/>
+                <a:graphic xmlns:a="http://schemas.openxmlformats.org/drawingml/2006/main">
+                  <a:graphicData uri="http://schemas.microsoft.com/office/word/2010/wordprocessingShape">
+                    <wps:wsp>
+                      <wps:cNvSpPr txBox="1"/>
+                      <wps:spPr>
+                        <a:xfrm>
+                          <a:off x="0" y="0"/>
+                          <a:ext cx="6675120" cy="9502140"/>
+                        </a:xfrm>
+                        <a:prstGeom prst="rect">
+                          <a:avLst/>
+                        </a:prstGeom>
+                        <a:solidFill>
+                          <a:srgbClr val="DFA06E"/>
+                        </a:solidFill>
+                        <a:ln w="6350">
+                          <a:solidFill>
+                            <a:prstClr val="black"/>
+                          </a:solidFill>
+                        </a:ln>
+                      </wps:spPr>
+                      <wps:txbx>
+                        <w:txbxContent>
+                          <w:p/>
+                        </w:txbxContent>
+                      </wps:txbx>
+                      <wps:bodyPr rot="0" spcFirstLastPara="0" vertOverflow="overflow" horzOverflow="overflow" vert="horz" wrap="square" lIns="91440" tIns="45720" rIns="91440" bIns="45720" numCol="1" spcCol="0" rtlCol="0" fromWordArt="0" anchor="t" anchorCtr="0" forceAA="0" compatLnSpc="1">
+                        <a:prstTxWarp prst="textNoShape">
+                          <a:avLst/>
+                        </a:prstTxWarp>
+                        <a:noAutofit/>
+                      </wps:bodyPr>
+                    </wps:wsp>
+                  </a:graphicData>
+                </a:graphic>
+                <wp14:sizeRelH relativeFrom="margin">
+                  <wp14:pctWidth>0</wp14:pctWidth>
+                </wp14:sizeRelH>
+                <wp14:sizeRelV relativeFrom="margin">
+                  <wp14:pctHeight>0</wp14:pctHeight>
+                </wp14:sizeRelV>
+              </wp:anchor>
+            </w:drawing>
+          </mc:Choice>
+          <mc:Fallback>
+            <w:pict>
+              <v:shape w14:anchorId="2377275A" id="Text Box 5" o:spid="_x0000_s1033" type="#_x0000_t202" style="position:absolute;margin-left:-33.45pt;margin-top:-19.85pt;width:525.6pt;height:748.2pt;z-index:251659775;visibility:visible;mso-wrap-style:square;mso-width-percent:0;mso-height-percent:0;mso-wrap-distance-left:9pt;mso-wrap-distance-top:0;mso-wrap-distance-right:9pt;mso-wrap-distance-bottom:0;mso-position-horizontal:absolute;mso-position-horizontal-relative:margin;mso-position-vertical:absolute;mso-position-vertical-relative:text;mso-width-percent:0;mso-height-percent:0;mso-width-relative:margin;mso-height-relative:margin;v-text-anchor:top" o:gfxdata="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" fillcolor="#dfa06e" strokeweight=".5pt">
+                <v:textbox>
+                  <w:txbxContent>
+                    <w:p/>
+                  </w:txbxContent>
+                </v:textbox>
+                <w10:wrap anchorx="margin"/>
+              </v:shape>
+            </w:pict>
+          </mc:Fallback>
+        </mc:AlternateContent>
+      </w:r>
+      <w:r>
+        <mc:AlternateContent>
+          <mc:Choice Requires="wps">
+            <w:drawing>
+              <wp:anchor distT="0" distB="0" distL="114300" distR="114300" simplePos="0" relativeHeight="251662336" behindDoc="0" locked="0" layoutInCell="1" allowOverlap="1" wp14:anchorId="6DF47546" wp14:editId="7B527093">
+                <wp:simplePos x="0" y="0"/>
+                <wp:positionH relativeFrom="column">
+                  <wp:posOffset>2270125</wp:posOffset>
+                </wp:positionH>
+                <wp:positionV relativeFrom="paragraph">
+                  <wp:posOffset>197485</wp:posOffset>
+                </wp:positionV>
+                <wp:extent cx="2209800" cy="457200"/>
+                <wp:effectExtent l="0" t="0" r="19050" b="19050"/>
+                <wp:wrapNone/>
+                <wp:docPr id="1320002465" name="Text Box 4"/>
+                <wp:cNvGraphicFramePr/>
+                <a:graphic xmlns:a="http://schemas.openxmlformats.org/drawingml/2006/main">
+                  <a:graphicData uri="http://schemas.microsoft.com/office/word/2010/wordprocessingShape">
+                    <wps:wsp>
+                      <wps:cNvSpPr txBox="1"/>
+                      <wps:spPr>
+                        <a:xfrm>
+                          <a:off x="0" y="0"/>
+                          <a:ext cx="2209800" cy="457200"/>
+                        </a:xfrm>
+                        <a:prstGeom prst="rect">
+                          <a:avLst/>
+                        </a:prstGeom>
+                        <a:solidFill>
+                          <a:schemeClr val="lt1"/>
+                        </a:solidFill>
+                        <a:ln w="6350">
+                          <a:solidFill>
+                            <a:prstClr val="black"/>
+                          </a:solidFill>
+                        </a:ln>
+                      </wps:spPr>
+                      <wps:txbx>
+                        <w:txbxContent>
+                          <w:p>
+                            <w:pPr>
+                              <w:rPr>
+                                <w:sz w:val="48"/>
+                                <w:szCs w:val="48"/>
+                              </w:rPr>
+                            </w:pPr>
+                            <w:r>
+                              <w:rPr>
+                                <w:sz w:val="48"/>
+                                <w:szCs w:val="48"/>
+                              </w:rPr>
+                              <w:t>Еколаби ООД</w:t>
+                            </w:r>
+                          </w:p>
+                        </w:txbxContent>
+                      </wps:txbx>
+                      <wps:bodyPr rot="0" spcFirstLastPara="0" vertOverflow="overflow" horzOverflow="overflow" vert="horz" wrap="square" lIns="91440" tIns="45720" rIns="91440" bIns="45720" numCol="1" spcCol="0" rtlCol="0" fromWordArt="0" anchor="t" anchorCtr="0" forceAA="0" compatLnSpc="1">
+                        <a:prstTxWarp prst="textNoShape">
+                          <a:avLst/>
+                        </a:prstTxWarp>
+                        <a:noAutofit/>
+                      </wps:bodyPr>
+                    </wps:wsp>
+                  </a:graphicData>
+                </a:graphic>
+                <wp14:sizeRelH relativeFrom="margin">
+                  <wp14:pctWidth>0</wp14:pctWidth>
+                </wp14:sizeRelH>
+                <wp14:sizeRelV relativeFrom="margin">
+                  <wp14:pctHeight>0</wp14:pctHeight>
+                </wp14:sizeRelV>
+              </wp:anchor>
+            </w:drawing>
+          </mc:Choice>
+          <mc:Fallback>
+            <w:pict>
+              <v:shape w14:anchorId="6DF47546" id="Text Box 4" o:spid="_x0000_s1034" type="#_x0000_t202" style="position:absolute;margin-left:178.75pt;margin-top:15.55pt;width:174pt;height:36pt;z-index:251662336;visibility:visible;mso-wrap-style:square;mso-width-percent:0;mso-height-percent:0;mso-wrap-distance-left:9pt;mso-wrap-distance-top:0;mso-wrap-distance-right:9pt;mso-wrap-distance-bottom:0;mso-position-horizontal:absolute;mso-position-horizontal-relative:text;mso-position-vertical:absolute;mso-position-vertical-relative:text;mso-width-percent:0;mso-height-percent:0;mso-width-relative:margin;mso-height-relative:margin;v-text-anchor:top" o:gfxdata="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" fillcolor="white [3201]" strokeweight=".5pt">
+                <v:textbox>
+                  <w:txbxContent>
+                    <w:p>
+                      <w:pPr>
+                        <w:rPr>
+                          <w:sz w:val="48"/>
+                          <w:szCs w:val="48"/>
+                        </w:rPr>
+                      </w:pPr>
+                      <w:r>
+                        <w:rPr>
+                          <w:sz w:val="48"/>
+                          <w:szCs w:val="48"/>
+                        </w:rPr>
+                        <w:t>Еколаби ООД</w:t>
+                      </w:r>
+                    </w:p>
+                  </w:txbxContent>
+                </v:textbox>
+              </v:shape>
+            </w:pict>
+          </mc:Fallback>
+        </mc:AlternateContent>
+      </w:r>
+      <w:r>
+        <mc:AlternateContent>
+          <mc:Choice Requires="wps">
+            <w:drawing>
+              <wp:anchor distT="0" distB="0" distL="114300" distR="114300" simplePos="0" relativeHeight="251661312" behindDoc="0" locked="0" layoutInCell="1" allowOverlap="1" wp14:anchorId="1581BA46" wp14:editId="6E1E8C7E">
+                <wp:simplePos x="0" y="0"/>
+                <wp:positionH relativeFrom="column">
+                  <wp:posOffset>-69215</wp:posOffset>
+                </wp:positionH>
+                <wp:positionV relativeFrom="paragraph">
+                  <wp:posOffset>197485</wp:posOffset>
+                </wp:positionV>
+                <wp:extent cx="754380" cy="647700"/>
+                <wp:effectExtent l="0" t="0" r="26670" b="19050"/>
+                <wp:wrapNone/>
+                <wp:docPr id="869202020" name="Text Box 3"/>
+                <wp:cNvGraphicFramePr/>
+                <a:graphic xmlns:a="http://schemas.openxmlformats.org/drawingml/2006/main">
+                  <a:graphicData uri="http://schemas.microsoft.com/office/word/2010/wordprocessingShape">
+                    <wps:wsp>
+                      <wps:cNvSpPr txBox="1"/>
+                      <wps:spPr>
+                        <a:xfrm>
+                          <a:off x="0" y="0"/>
+                          <a:ext cx="754380" cy="647700"/>
+                        </a:xfrm>
+                        <a:prstGeom prst="rect">
+                          <a:avLst/>
+                        </a:prstGeom>
+                        <a:solidFill>
+                          <a:schemeClr val="lt1"/>
+                        </a:solidFill>
+                        <a:ln w="6350">
+                          <a:solidFill>
+                            <a:prstClr val="black"/>
+                          </a:solidFill>
+                        </a:ln>
+                      </wps:spPr>
+                      <wps:txbx>
+                        <w:txbxContent>
+                          <w:p>
+                            <w:pPr>
+                              <w:rPr>
+                                <w:lang w:val="en-US"/>
+                              </w:rPr>
+                            </w:pPr>
+                            <w:r>
+                              <w:rPr>
+                                <w:lang w:val="en-US"/>
+                              </w:rPr>
+                              <w:t>logo</w:t>
+                            </w:r>
+                          </w:p>
+                        </w:txbxContent>
+                      </wps:txbx>
+                      <wps:bodyPr rot="0" spcFirstLastPara="0" vertOverflow="overflow" horzOverflow="overflow" vert="horz" wrap="square" lIns="91440" tIns="45720" rIns="91440" bIns="45720" numCol="1" spcCol="0" rtlCol="0" fromWordArt="0" anchor="t" anchorCtr="0" forceAA="0" compatLnSpc="1">
+                        <a:prstTxWarp prst="textNoShape">
+                          <a:avLst/>
+                        </a:prstTxWarp>
+                        <a:noAutofit/>
+                      </wps:bodyPr>
+                    </wps:wsp>
+                  </a:graphicData>
+                </a:graphic>
+              </wp:anchor>
+            </w:drawing>
+          </mc:Choice>
+          <mc:Fallback>
+            <w:pict>
+              <v:shape w14:anchorId="1581BA46" id="Text Box 3" o:spid="_x0000_s1035" type="#_x0000_t202" style="position:absolute;margin-left:-5.45pt;margin-top:15.55pt;width:59.4pt;height:51pt;z-index:251661312;visibility:visible;mso-wrap-style:square;mso-wrap-distance-left:9pt;mso-wrap-distance-top:0;mso-wrap-distance-right:9pt;mso-wrap-distance-bottom:0;mso-position-horizontal:absolute;mso-position-horizontal-relative:text;mso-position-vertical:absolute;mso-position-vertical-relative:text;v-text-anchor:top" o:gfxdata="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" fillcolor="white [3201]" strokeweight=".5pt">
+                <v:textbox>
+                  <w:txbxContent>
+                    <w:p>
+                      <w:pPr>
+                        <w:rPr>
+                          <w:lang w:val="en-US"/>
+                        </w:rPr>
+                      </w:pPr>
+                      <w:r>
+                        <w:rPr>
+                          <w:lang w:val="en-US"/>
+                        </w:rPr>
+                        <w:t>logo</w:t>
+                      </w:r>
+                    </w:p>
+                  </w:txbxContent>
+                </v:textbox>
+              </v:shape>
+            </w:pict>
+          </mc:Fallback>
+        </mc:AlternateContent>
+      </w:r>
+      <w:r>
+        <mc:AlternateContent>
+          <mc:Choice Requires="wps">
+            <w:drawing>
+              <wp:anchor distT="0" distB="0" distL="114300" distR="114300" simplePos="0" relativeHeight="251659264" behindDoc="0" locked="0" layoutInCell="1" allowOverlap="1" wp14:anchorId="5FB19E0A" wp14:editId="2D8CCAB4">
+                <wp:simplePos x="0" y="0"/>
+                <wp:positionH relativeFrom="column">
+                  <wp:posOffset>-602615</wp:posOffset>
+                </wp:positionH>
+                <wp:positionV relativeFrom="paragraph">
+                  <wp:posOffset>-534035</wp:posOffset>
+                </wp:positionV>
+                <wp:extent cx="7002780" cy="9982200"/>
+                <wp:effectExtent l="0" t="0" r="26670" b="19050"/>
+                <wp:wrapNone/>
+                <wp:docPr id="871718969" name="Text Box 1"/>
+                <wp:cNvGraphicFramePr/>
+                <a:graphic xmlns:a="http://schemas.openxmlformats.org/drawingml/2006/main">
+                  <a:graphicData uri="http://schemas.microsoft.com/office/word/2010/wordprocessingShape">
+                    <wps:wsp>
+                      <wps:cNvSpPr txBox="1"/>
+                      <wps:spPr>
+                        <a:xfrm>
+                          <a:off x="0" y="0"/>
+                          <a:ext cx="7002780" cy="9982200"/>
+                        </a:xfrm>
+                        <a:prstGeom prst="rect">
+                          <a:avLst/>
+                        </a:prstGeom>
+                        <a:gradFill>
+                          <a:gsLst>
+                            <a:gs pos="0">
+                              <a:srgbClr val="7EA172"/>
+                            </a:gs>
+                            <a:gs pos="100000">
+                              <a:srgbClr val="353D2F"/>
+                            </a:gs>
+                          </a:gsLst>
+                          <a:lin ang="3600000" scaled="0"/>
+                        </a:gradFill>
+                        <a:ln w="6350">
+                          <a:solidFill>
+                            <a:prstClr val="black"/>
+                          </a:solidFill>
+                        </a:ln>
+                      </wps:spPr>
+                      <wps:txbx>
+                        <w:txbxContent>
+                          <w:p>
+                            <w:pPr>
+                              <w:rPr>
+                                <w:lang w:val="en-US"/>
+                              </w:rPr>
+                            </w:pPr>
+                            <w:r>
+                              <w:rPr>
+                                <w:lang w:val="en-US"/>
+                              </w:rPr>
+                              <w:t>Id body</w:t>
+                            </w:r>
+                          </w:p>
+                        </w:txbxContent>
+                      </wps:txbx>
+                      <wps:bodyPr rot="0" spcFirstLastPara="0" vertOverflow="overflow" horzOverflow="overflow" vert="horz" wrap="square" lIns="91440" tIns="45720" rIns="91440" bIns="45720" numCol="1" spcCol="0" rtlCol="0" fromWordArt="0" anchor="t" anchorCtr="0" forceAA="0" compatLnSpc="1">
+                        <a:prstTxWarp prst="textNoShape">
+                          <a:avLst/>
+                        </a:prstTxWarp>
+                        <a:noAutofit/>
+                      </wps:bodyPr>
+                    </wps:wsp>
+                  </a:graphicData>
+                </a:graphic>
+                <wp14:sizeRelH relativeFrom="margin">
+                  <wp14:pctWidth>0</wp14:pctWidth>
+                </wp14:sizeRelH>
+                <wp14:sizeRelV relativeFrom="margin">
+                  <wp14:pctHeight>0</wp14:pctHeight>
+                </wp14:sizeRelV>
+              </wp:anchor>
+            </w:drawing>
+          </mc:Choice>
+          <mc:Fallback>
+            <w:pict>
+              <v:shape w14:anchorId="5FB19E0A" id="Text Box 1" o:spid="_x0000_s1036" type="#_x0000_t202" style="position:absolute;margin-left:-47.45pt;margin-top:-42.05pt;width:551.4pt;height:786pt;z-index:251659264;visibility:visible;mso-wrap-style:square;mso-width-percent:0;mso-height-percent:0;mso-wrap-distance-left:9pt;mso-wrap-distance-top:0;mso-wrap-distance-right:9pt;mso-wrap-distance-bottom:0;mso-position-horizontal:absolute;mso-position-horizontal-relative:text;mso-position-vertical:absolute;mso-position-vertical-relative:text;mso-width-percent:0;mso-height-percent:0;mso-width-relative:margin;mso-height-relative:margin;v-text-anchor:top" o:gfxdata="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" fillcolor="#7ea172" strokeweight=".5pt">
+                <v:fill color2="#353d2f" angle="30" focus="100%" type="gradient">
+                  <o:fill v:ext="view" type="gradientUnscaled"/>
+                </v:fill>
+                <v:textbox>
+                  <w:txbxContent>
+                    <w:p>
+                      <w:pPr>
+                        <w:rPr>
+                          <w:lang w:val="en-US"/>
+                        </w:rPr>
+                      </w:pPr>
+                      <w:r>
+                        <w:rPr>
+                          <w:lang w:val="en-US"/>
+                        </w:rPr>
+                        <w:t>Id body</w:t>
+                      </w:r>
+                    </w:p>
+                  </w:txbxContent>
+                </v:textbox>
+              </v:shape>
+            </w:pict>
+          </mc:Fallback>
+        </mc:AlternateContent>
+      </w:r>
+    </w:p>
     <w:sectPr>
       <w:pgSz w:w="11906" w:h="16838"/>
       <w:pgMar w:top="1417" w:right="1417" w:bottom="1417" w:left="1417" w:header="708" w:footer="708" w:gutter="0"/>

</xml_diff>